<commit_message>
test(pdf): retain a trailing paragraph after fitting note tables
</commit_message>
<xml_diff>
--- a/fixtures/notes-fitting-nested-table.docx
+++ b/fixtures/notes-fitting-nested-table.docx
@@ -731,6 +731,14 @@
         </w:tc>
       </w:tr>
     </w:tbl>
+    <w:p>
+      <w:pPr>
+        <w:spacing w:before="0" w:after="0" w:line="1" w:lineRule="exact"/>
+        <w:rPr>
+          <w:sz w:val="2"/>
+        </w:rPr>
+      </w:pPr>
+    </w:p>
   </w:footnote>
 </w:footnotes>
 </file>

</xml_diff>